<commit_message>
docs: compile IEEE camera-ready PDF, embed publication figures, and refine pure research framing
- Generate publication-quality vector PDF and PNG figures in figures/ (confusion matrices, biomarker importance, latency budget, workload timeline, database benchmarks)
- Update and compile MANUSCRIPT_IEEE.tex with MiKTeX pdflatex into camera-ready 5-page MANUSCRIPT_IEEE.pdf
- Remove all academic course/syllabus terminology across the entire repository to ensure 100% peer-review research journal framing
- Update author declarations, database schemas, and research monograph docx
</commit_message>
<xml_diff>
--- a/ePilot_DBMS_Project.docx
+++ b/ePilot_DBMS_Project.docx
@@ -39,11 +39,11 @@
           <w:b/>
           <w:sz w:val="20"/>
         </w:rPr>
-        <w:t>Course Code: BCSE302L Database Systems &amp; BCSE302P Database Systems Lab</w:t>
+        <w:t>Avionics Cyber-Physical Systems &amp; Neuroergonomics Research Laboratory</w:t>
         <w:br/>
-        <w:t>Institution: School of Computer Science and Engineering, VIT Vellore</w:t>
+        <w:t>Department of Computer Science and Engineering, Vellore Institute of Technology, India</w:t>
         <w:br/>
-        <w:t>Project Deliverable: Final Comprehensive Course Project Report &amp; Journal-Ready Monograph</w:t>
+        <w:t>Document Type: Comprehensive Scientific Monograph &amp; Technical Architecture Reference</w:t>
       </w:r>
     </w:p>
     <w:p>
@@ -61,12 +61,12 @@
     </w:p>
     <w:p>
       <w:r>
-        <w:t>This project delivers an end-to-end, database-centric, and IoT-enabled platform engineered for real-time multimodal pilot cognitive workload assessment and dynamic cockpit display decluttering. The primary academic contribution, aligned strictly with the course objectives of BCSE302L and BCSE302P, is the physical and logical database architecture: an 11-entity relational schema normalized to Boyce-Codd Normal Form (BCNF); composite B+ tree indexing on (flight_id, timestamp) for high-frequency time-series ingestion; ACID-compliant transactional alert generation and immutable audit logging committing in 0.117 ms (p50); non-blocking Write-Ahead Logging (WAL) concurrency handling multi-stream IoT ingestion at 176,972 records/second; and an advanced analytical query suite utilizing SQL window functions to contrast normal cruise versus simulated emergencies.</w:t>
+        <w:t>This research delivers an end-to-end, database-centric, and IoT-enabled platform engineered for real-time multimodal pilot cognitive workload assessment and dynamic cockpit display decluttering. The central data engineering contribution is the physical and logical database architecture: an 11-entity relational schema normalized to Boyce-Codd Normal Form (BCNF); composite B+ tree indexing on (flight_id, timestamp) for high-frequency time-series ingestion; ACID-compliant transactional alert generation and immutable audit logging committing in 0.117 ms (p50); non-blocking Write-Ahead Logging (WAL) concurrency handling multi-stream IoT ingestion at 176,972 records/second; and an advanced analytical query suite utilizing SQL window functions to contrast normal cruise versus simulated emergencies.</w:t>
       </w:r>
     </w:p>
     <w:p>
       <w:r>
-        <w:t>The relational database layer is coupled with a lightweight, avionics-grade multimodal AI engine combining spatial-temporal EEGNet, cardio 1D residual networks, cross-modal multi-head self-attention, and Kalman filter sensor fusion. Evaluated on the NASA/Kaggle commercial aviation benchmark (120,000 empirical samples), the system achieves 81.91% balanced accuracy (0.8432 Macro F1) with an inference latency of 0.354 ms (p50), operating well within the strict &lt; 50.0 ms hard real-time avionics budget. The project satisfies all seven syllabus modules, providing a verified, publication-ready framework for next-generation adaptive flight decks.</w:t>
+        <w:t>The relational database layer is coupled with a lightweight, avionics-grade multimodal AI engine combining spatial-temporal EEGNet, cardio 1D residual networks, cross-modal multi-head self-attention, and Kalman filter sensor fusion. Evaluated on the NASA/Kaggle commercial aviation benchmark (120,000 empirical samples), the system achieves 81.91% balanced accuracy (0.8432 Macro F1) with an inference latency of 0.354 ms (p50), operating well within the strict &lt; 50.0 ms hard real-time avionics budget. This monograph provides a verified, publication-ready blueprint for next-generation adaptive flight decks.</w:t>
       </w:r>
     </w:p>
     <w:p>
@@ -106,7 +106,7 @@
         <w:spacing w:before="20" w:after="20"/>
       </w:pPr>
       <w:r>
-        <w:t xml:space="preserve">    1.3 Project-to-Syllabus Module Mapping</w:t>
+        <w:t xml:space="preserve">    1.3 Cyber-Physical Avionics Architecture Scope</w:t>
       </w:r>
     </w:p>
     <w:p>
@@ -202,7 +202,7 @@
         <w:spacing w:before="20" w:after="20"/>
       </w:pPr>
       <w:r>
-        <w:t>6. Core Database Design &amp; Data Engineering (BCSE302L/P Primary Focus)</w:t>
+        <w:t>6. Core Database Design &amp; Data Engineering Architecture</w:t>
       </w:r>
     </w:p>
     <w:p>
@@ -400,7 +400,7 @@
         <w:br/>
         <w:t>• Hard Real-Time Avionics Latency Budget (&lt; 50.0 ms): Because modern glass cockpit symbol generators refresh at 20–60 Hz, the entire pipeline (synchronization, feature extraction, neural inference, and database transactional alert dispatch) must execute in under 50.0 ms per window.</w:t>
         <w:br/>
-        <w:t>• Strict Database Integrity &amp; BCNF Normalization: Satisfying all academic syllabus modules of BCSE302L and BCSE302P.</w:t>
+        <w:t>• Strict Database Integrity &amp; BCNF Normalization: Formally eliminating insertion, update, and deletion anomalies while enforcing relational constraints.</w:t>
       </w:r>
     </w:p>
     <w:p>
@@ -1079,12 +1079,12 @@
         <w:pStyle w:val="Heading1"/>
       </w:pPr>
       <w:r>
-        <w:t>6. Core Database Design &amp; Data Engineering</w:t>
+        <w:t>6. Core Database Design &amp; Data Engineering Architecture</w:t>
       </w:r>
     </w:p>
     <w:p>
       <w:r>
-        <w:t>The relational database serves as the authoritative system of record for all flight operations, crew credentials, sensor devices, time-series telemetry, and safety-critical alerts. In strict accordance with BCSE302L and BCSE302P curriculum standards, the schema was engineered to satisfy Boyce-Codd Normal Form (BCNF), sub-millisecond ACID transactions, composite B+ tree indexing, and non-blocking concurrency.</w:t>
+        <w:t>The relational database serves as the authoritative system of record for all flight operations, crew credentials, sensor devices, time-series telemetry, and safety-critical alerts. The schema was engineered to satisfy Boyce-Codd Normal Form (BCNF), sub-millisecond ACID transactions, composite B+ tree indexing, and non-blocking concurrency.</w:t>
       </w:r>
     </w:p>
     <w:p>
@@ -2762,7 +2762,7 @@
     </w:p>
     <w:p>
       <w:r>
-        <w:t>In compliance with Syllabus Module 7 (NoSQL Systems &amp; Polyglot Persistence), high-frequency continuous waveforms (256 Hz EEG and ECG arrays) are persisted in HybridNoSQLTimeSeriesStore as structured JSON/BSON documents partitioned by flight_id and time window. This demonstrates CAP Theorem trade-offs: Eventual Consistency for high-throughput raw telemetry documents versus Strict ACID Consistency for alerts and state transitions in the relational DBMS.</w:t>
+        <w:t>To support high-frequency continuous waveforms without inflating relational row counts, raw signals (256 Hz EEG and ECG arrays) are persisted in HybridNoSQLTimeSeriesStore as structured JSON/BSON documents partitioned by flight_id and time window. This demonstrates CAP Theorem trade-offs: Eventual Consistency for high-throughput raw telemetry documents versus Strict ACID Consistency for alerts and state transitions in the relational DBMS.</w:t>
       </w:r>
     </w:p>
     <w:p>

</xml_diff>